<commit_message>
Add Gate 8/9 to the PLOS ONE manuscript; prep tool as a JOSS submission
Manuscript: new Section 3.8/Table 6 and a Discussion paragraph covering
both real-figure validations, reference [22] (Zhao et al.). Docx
regenerated.

JOSS: MIT LICENSE, README.md (statement of need, install, usage, known
limitations), joss/paper.md + paper.bib. Adds pillow as an explicit
dependency (already required by digitize/common.py, was only transitive).
</commit_message>
<xml_diff>
--- a/docs/ergofluids_manuscript_PLOS_ONE.docx
+++ b/docs/ergofluids_manuscript_PLOS_ONE.docx
@@ -2,7 +2,7 @@
 <file path=word/document.xml><?xml version="1.0" encoding="utf-8"?>
 <w:document xmlns:w="http://schemas.openxmlformats.org/wordprocessingml/2006/main" xmlns:m="http://schemas.openxmlformats.org/officeDocument/2006/math" xmlns:r="http://schemas.openxmlformats.org/officeDocument/2006/relationships" xmlns:o="urn:schemas-microsoft-com:office:office" xmlns:v="urn:schemas-microsoft-com:vml" xmlns:w10="urn:schemas-microsoft-com:office:word" xmlns:a="http://schemas.openxmlformats.org/drawingml/2006/main" xmlns:pic="http://schemas.openxmlformats.org/drawingml/2006/picture" xmlns:wp="http://schemas.openxmlformats.org/drawingml/2006/wordprocessingDrawing">
   <w:body>
-    <w:bookmarkStart w:id="45" w:name="X1267813817eface1f54961bf6c2d5bd2916dd31"/>
+    <w:bookmarkStart w:id="46" w:name="X1267813817eface1f54961bf6c2d5bd2916dd31"/>
     <w:p>
       <w:pPr>
         <w:pStyle w:val="Heading1"/>
@@ -1590,7 +1590,7 @@
     </w:p>
     <w:bookmarkEnd w:id="29"/>
     <w:bookmarkEnd w:id="30"/>
-    <w:bookmarkStart w:id="38" w:name="results"/>
+    <w:bookmarkStart w:id="39" w:name="results"/>
     <w:p>
       <w:pPr>
         <w:pStyle w:val="Heading2"/>
@@ -5016,8 +5016,361 @@
       </w:tr>
     </w:tbl>
     <w:bookmarkEnd w:id="37"/>
+    <w:bookmarkStart w:id="38" w:name="external-real-figure-validation-gate-8"/>
+    <w:p>
+      <w:pPr>
+        <w:pStyle w:val="Heading3"/>
+        <w:spacing w:line="480" w:lineRule="auto"/>
+      </w:pPr>
+      <w:r>
+        <w:t xml:space="preserve">3.8 External real-figure validation (Gate 8)</w:t>
+      </w:r>
+    </w:p>
+    <w:p>
+      <w:pPr>
+        <w:pStyle w:val="FirstParagraph"/>
+        <w:spacing w:line="480" w:lineRule="auto"/>
+      </w:pPr>
+      <w:r>
+        <w:t xml:space="preserve">Gate 7 validates the extraction machinery against a synthetic panel with an analytically known</w:t>
+      </w:r>
+      <w:r>
+        <w:t xml:space="preserve"> </w:t>
+      </w:r>
+      <w:r>
+        <w:t xml:space="preserve">calibration; it does not test the tick-mark calibration step itself, since no independent ground</w:t>
+      </w:r>
+      <w:r>
+        <w:t xml:space="preserve"> </w:t>
+      </w:r>
+      <w:r>
+        <w:t xml:space="preserve">truth exists for that step on a real page. As a separate check, the digitization pipeline was</w:t>
+      </w:r>
+      <w:r>
+        <w:t xml:space="preserve"> </w:t>
+      </w:r>
+      <w:r>
+        <w:t xml:space="preserve">generalized into a config-driven tool and tested on a real, external figure never otherwise used in</w:t>
+      </w:r>
+      <w:r>
+        <w:t xml:space="preserve"> </w:t>
+      </w:r>
+      <w:r>
+        <w:t xml:space="preserve">this study: Fig. 1b of Zhao et al. [22], which labels its own 7%-coverage EA-MSD curve’s fitted</w:t>
+      </w:r>
+      <w:r>
+        <w:t xml:space="preserve"> </w:t>
+      </w:r>
+      <w:r>
+        <w:t xml:space="preserve">slope as 0.85. The pipeline, including programmatic tick-mark detection, recovered an exponent of</w:t>
+      </w:r>
+      <w:r>
+        <w:t xml:space="preserve"> </w:t>
+      </w:r>
+      <w:r>
+        <w:t xml:space="preserve">0.852 (Table 6), a difference of 0.002 from the paper’s own stated value.</w:t>
+      </w:r>
+    </w:p>
+    <w:p>
+      <w:pPr>
+        <w:pStyle w:val="BodyText"/>
+        <w:spacing w:line="480" w:lineRule="auto"/>
+      </w:pPr>
+      <w:r>
+        <w:t xml:space="preserve">This test also surfaced a limitation the synthetic case could not: unlike the panels used elsewhere</w:t>
+      </w:r>
+      <w:r>
+        <w:t xml:space="preserve"> </w:t>
+      </w:r>
+      <w:r>
+        <w:t xml:space="preserve">in this study, this figure has no plotted per-point error bars, and a slope-reference annotation</w:t>
+      </w:r>
+      <w:r>
+        <w:t xml:space="preserve"> </w:t>
+      </w:r>
+      <w:r>
+        <w:t xml:space="preserve">line crossing the curve inflated</w:t>
+      </w:r>
+      <w:r>
+        <w:t xml:space="preserve"> </w:t>
+      </w:r>
+      <w:r>
+        <w:rPr>
+          <w:rStyle w:val="VerbatimChar"/>
+        </w:rPr>
+        <w:t xml:space="preserve">reported_error</w:t>
+      </w:r>
+      <w:r>
+        <w:t xml:space="preserve"> </w:t>
+      </w:r>
+      <w:r>
+        <w:t xml:space="preserve">in the region it crosses, producing a wide,</w:t>
+      </w:r>
+      <w:r>
+        <w:t xml:space="preserve"> </w:t>
+      </w:r>
+      <w:r>
+        <w:t xml:space="preserve">asymmetric confidence interval despite the accurate point estimate. The</w:t>
+      </w:r>
+      <w:r>
+        <w:t xml:space="preserve"> </w:t>
+      </w:r>
+      <w:r>
+        <w:rPr>
+          <w:rStyle w:val="VerbatimChar"/>
+        </w:rPr>
+        <w:t xml:space="preserve">y</w:t>
+      </w:r>
+      <w:r>
+        <w:t xml:space="preserve"> </w:t>
+      </w:r>
+      <w:r>
+        <w:t xml:space="preserve">values themselves were</w:t>
+      </w:r>
+      <w:r>
+        <w:t xml:space="preserve"> </w:t>
+      </w:r>
+      <w:r>
+        <w:t xml:space="preserve">unaffected. We report this as a scoped limitation of the uncertainty quantification for bare-marker</w:t>
+      </w:r>
+      <w:r>
+        <w:t xml:space="preserve"> </w:t>
+      </w:r>
+      <w:r>
+        <w:t xml:space="preserve">figures, not of the extraction itself.</w:t>
+      </w:r>
+    </w:p>
+    <w:p>
+      <w:pPr>
+        <w:pStyle w:val="BodyText"/>
+        <w:spacing w:line="480" w:lineRule="auto"/>
+      </w:pPr>
+      <w:r>
+        <w:rPr>
+          <w:bCs/>
+          <w:b/>
+        </w:rPr>
+        <w:t xml:space="preserve">Table 6. Gate 8: real-figure exponent recovery.</w:t>
+      </w:r>
+    </w:p>
+    <w:tbl>
+      <w:tblPr>
+        <w:tblStyle w:val="Table"/>
+        <w:tblW w:type="auto" w:w="0"/>
+        <w:tblLook w:firstRow="1" w:lastRow="0" w:firstColumn="0" w:lastColumn="0" w:noHBand="0" w:noVBand="0" w:val="0020"/>
+        <w:jc w:val="start"/>
+      </w:tblPr>
+      <w:tblGrid>
+        <w:gridCol w:w="3960"/>
+        <w:gridCol w:w="3960"/>
+      </w:tblGrid>
+      <w:tr>
+        <w:trPr>
+          <w:tblHeader w:val="true"/>
+        </w:trPr>
+        <w:tc>
+          <w:tcPr/>
+          <w:p>
+            <w:pPr>
+              <w:pStyle w:val="Compact"/>
+              <w:spacing w:line="480" w:lineRule="auto"/>
+              <w:jc w:val="left"/>
+            </w:pPr>
+            <w:r>
+              <w:t xml:space="preserve">quantity</w:t>
+            </w:r>
+          </w:p>
+        </w:tc>
+        <w:tc>
+          <w:tcPr/>
+          <w:p>
+            <w:pPr>
+              <w:pStyle w:val="Compact"/>
+              <w:spacing w:line="480" w:lineRule="auto"/>
+              <w:jc w:val="left"/>
+            </w:pPr>
+            <w:r>
+              <w:t xml:space="preserve">value</w:t>
+            </w:r>
+          </w:p>
+        </w:tc>
+      </w:tr>
+      <w:tr>
+        <w:tc>
+          <w:tcPr/>
+          <w:p>
+            <w:pPr>
+              <w:pStyle w:val="Compact"/>
+              <w:spacing w:line="480" w:lineRule="auto"/>
+              <w:jc w:val="left"/>
+            </w:pPr>
+            <w:r>
+              <w:t xml:space="preserve">recovered exponent (ssa)</w:t>
+            </w:r>
+          </w:p>
+        </w:tc>
+        <w:tc>
+          <w:tcPr/>
+          <w:p>
+            <w:pPr>
+              <w:pStyle w:val="Compact"/>
+              <w:spacing w:line="480" w:lineRule="auto"/>
+              <w:jc w:val="left"/>
+            </w:pPr>
+            <w:r>
+              <w:t xml:space="preserve">0.852</w:t>
+            </w:r>
+          </w:p>
+        </w:tc>
+      </w:tr>
+      <w:tr>
+        <w:tc>
+          <w:tcPr/>
+          <w:p>
+            <w:pPr>
+              <w:pStyle w:val="Compact"/>
+              <w:spacing w:line="480" w:lineRule="auto"/>
+              <w:jc w:val="left"/>
+            </w:pPr>
+            <w:r>
+              <w:t xml:space="preserve">95% CI</w:t>
+            </w:r>
+          </w:p>
+        </w:tc>
+        <w:tc>
+          <w:tcPr/>
+          <w:p>
+            <w:pPr>
+              <w:pStyle w:val="Compact"/>
+              <w:spacing w:line="480" w:lineRule="auto"/>
+              <w:jc w:val="left"/>
+            </w:pPr>
+            <w:r>
+              <w:t xml:space="preserve">[0.079, 0.869]</w:t>
+            </w:r>
+          </w:p>
+        </w:tc>
+      </w:tr>
+      <w:tr>
+        <w:tc>
+          <w:tcPr/>
+          <w:p>
+            <w:pPr>
+              <w:pStyle w:val="Compact"/>
+              <w:spacing w:line="480" w:lineRule="auto"/>
+              <w:jc w:val="left"/>
+            </w:pPr>
+            <w:r>
+              <w:t xml:space="preserve">paper’s own stated value</w:t>
+            </w:r>
+          </w:p>
+        </w:tc>
+        <w:tc>
+          <w:tcPr/>
+          <w:p>
+            <w:pPr>
+              <w:pStyle w:val="Compact"/>
+              <w:spacing w:line="480" w:lineRule="auto"/>
+              <w:jc w:val="left"/>
+            </w:pPr>
+            <w:r>
+              <w:t xml:space="preserve">0.85</w:t>
+            </w:r>
+          </w:p>
+        </w:tc>
+      </w:tr>
+      <w:tr>
+        <w:tc>
+          <w:tcPr/>
+          <w:p>
+            <w:pPr>
+              <w:pStyle w:val="Compact"/>
+              <w:spacing w:line="480" w:lineRule="auto"/>
+              <w:jc w:val="left"/>
+            </w:pPr>
+            <w:r>
+              <w:t xml:space="preserve">absolute difference</w:t>
+            </w:r>
+          </w:p>
+        </w:tc>
+        <w:tc>
+          <w:tcPr/>
+          <w:p>
+            <w:pPr>
+              <w:pStyle w:val="Compact"/>
+              <w:spacing w:line="480" w:lineRule="auto"/>
+              <w:jc w:val="left"/>
+            </w:pPr>
+            <w:r>
+              <w:t xml:space="preserve">0.002</w:t>
+            </w:r>
+          </w:p>
+        </w:tc>
+      </w:tr>
+    </w:tbl>
+    <w:p>
+      <w:pPr>
+        <w:pStyle w:val="BodyText"/>
+        <w:spacing w:line="480" w:lineRule="auto"/>
+      </w:pPr>
+      <w:r>
+        <w:t xml:space="preserve">A second, independent real-figure test followed, on a different curve, color, and target value in</w:t>
+      </w:r>
+      <w:r>
+        <w:t xml:space="preserve"> </w:t>
+      </w:r>
+      <w:r>
+        <w:t xml:space="preserve">the same paper: Fig. 1d’s blue</w:t>
+      </w:r>
+      <w:r>
+        <w:t xml:space="preserve"> </w:t>
+      </w:r>
+      <w:r>
+        <w:rPr>
+          <w:rStyle w:val="VerbatimChar"/>
+        </w:rPr>
+        <w:t xml:space="preserve">&lt;TA-MSD&gt;</w:t>
+      </w:r>
+      <w:r>
+        <w:t xml:space="preserve"> </w:t>
+      </w:r>
+      <w:r>
+        <w:t xml:space="preserve">curve at the same 7% coverage, labeled 0.98. A first attempt</w:t>
+      </w:r>
+      <w:r>
+        <w:t xml:space="preserve"> </w:t>
+      </w:r>
+      <w:r>
+        <w:t xml:space="preserve">recovered 0.653, a large miss, traced to the panel’s own same-colored slope-reference label text</w:t>
+      </w:r>
+      <w:r>
+        <w:t xml:space="preserve"> </w:t>
+      </w:r>
+      <w:r>
+        <w:t xml:space="preserve">being binned as curve data; generalizing the tool’s single legend-exclusion box into a list of</w:t>
+      </w:r>
+      <w:r>
+        <w:t xml:space="preserve"> </w:t>
+      </w:r>
+      <w:r>
+        <w:t xml:space="preserve">exclusion boxes resolved it. The corrected run recovered 0.918 (95% CI [0.844, 1.345]), a difference</w:t>
+      </w:r>
+      <w:r>
+        <w:t xml:space="preserve"> </w:t>
+      </w:r>
+      <w:r>
+        <w:t xml:space="preserve">of 0.062 from the paper’s stated value. That the two targets (0.85 and 0.98) are far apart rules out</w:t>
+      </w:r>
+      <w:r>
+        <w:t xml:space="preserve"> </w:t>
+      </w:r>
+      <w:r>
+        <w:t xml:space="preserve">the pass being an artifact of the estimator drifting toward one particular number.</w:t>
+      </w:r>
+    </w:p>
     <w:bookmarkEnd w:id="38"/>
-    <w:bookmarkStart w:id="39" w:name="discussion"/>
+    <w:bookmarkEnd w:id="39"/>
+    <w:bookmarkStart w:id="40" w:name="discussion"/>
     <w:p>
       <w:pPr>
         <w:pStyle w:val="Heading2"/>
@@ -5663,8 +6016,47 @@
         <w:t xml:space="preserve">code.</w:t>
       </w:r>
     </w:p>
-    <w:bookmarkEnd w:id="39"/>
-    <w:bookmarkStart w:id="40" w:name="limitations"/>
+    <w:p>
+      <w:pPr>
+        <w:pStyle w:val="BodyText"/>
+        <w:spacing w:line="480" w:lineRule="auto"/>
+      </w:pPr>
+      <w:r>
+        <w:t xml:space="preserve">Since generalized into a config-driven tool, the pipeline was also tested end to end on a real,</w:t>
+      </w:r>
+      <w:r>
+        <w:t xml:space="preserve"> </w:t>
+      </w:r>
+      <w:r>
+        <w:t xml:space="preserve">external figure it had never seen (Gate 8, Section 3.8), recovering the paper’s own stated exponent</w:t>
+      </w:r>
+      <w:r>
+        <w:t xml:space="preserve"> </w:t>
+      </w:r>
+      <w:r>
+        <w:t xml:space="preserve">to within 0.002 while surfacing a genuine, now-documented limitation in uncertainty quantification</w:t>
+      </w:r>
+      <w:r>
+        <w:t xml:space="preserve"> </w:t>
+      </w:r>
+      <w:r>
+        <w:t xml:space="preserve">for figures without plotted error bars. We regard this as a second, independent line of support for</w:t>
+      </w:r>
+      <w:r>
+        <w:t xml:space="preserve"> </w:t>
+      </w:r>
+      <w:r>
+        <w:t xml:space="preserve">the digitization methodology as a reusable contribution, alongside the honest record of where it</w:t>
+      </w:r>
+      <w:r>
+        <w:t xml:space="preserve"> </w:t>
+      </w:r>
+      <w:r>
+        <w:t xml:space="preserve">currently falls short.</w:t>
+      </w:r>
+    </w:p>
+    <w:bookmarkEnd w:id="40"/>
+    <w:bookmarkStart w:id="41" w:name="limitations"/>
     <w:p>
       <w:pPr>
         <w:pStyle w:val="Heading2"/>
@@ -5863,8 +6255,8 @@
         <w:t xml:space="preserve">correct, since no ground truth exists for that step on the real PDF pages.</w:t>
       </w:r>
     </w:p>
-    <w:bookmarkEnd w:id="40"/>
-    <w:bookmarkStart w:id="41" w:name="conclusion"/>
+    <w:bookmarkEnd w:id="41"/>
+    <w:bookmarkStart w:id="42" w:name="conclusion"/>
     <w:p>
       <w:pPr>
         <w:pStyle w:val="Heading2"/>
@@ -5985,8 +6377,8 @@
         <w:t xml:space="preserve">documented extraction-bug history.</w:t>
       </w:r>
     </w:p>
-    <w:bookmarkEnd w:id="41"/>
-    <w:bookmarkStart w:id="42" w:name="competing-interests"/>
+    <w:bookmarkEnd w:id="42"/>
+    <w:bookmarkStart w:id="43" w:name="competing-interests"/>
     <w:p>
       <w:pPr>
         <w:pStyle w:val="Heading2"/>
@@ -6005,8 +6397,8 @@
         <w:t xml:space="preserve">The author declares no competing interests.</w:t>
       </w:r>
     </w:p>
-    <w:bookmarkEnd w:id="42"/>
-    <w:bookmarkStart w:id="43" w:name="data-availability"/>
+    <w:bookmarkEnd w:id="43"/>
+    <w:bookmarkStart w:id="44" w:name="data-availability"/>
     <w:p>
       <w:pPr>
         <w:pStyle w:val="Heading2"/>
@@ -6106,8 +6498,8 @@
         <w:t xml:space="preserve">).</w:t>
       </w:r>
     </w:p>
-    <w:bookmarkEnd w:id="43"/>
-    <w:bookmarkStart w:id="44" w:name="references"/>
+    <w:bookmarkEnd w:id="44"/>
+    <w:bookmarkStart w:id="45" w:name="references"/>
     <w:p>
       <w:pPr>
         <w:pStyle w:val="Heading2"/>
@@ -6495,8 +6887,26 @@
         <w:t xml:space="preserve">analysis. Phys Rev E. 2017;96(3):033310.</w:t>
       </w:r>
     </w:p>
-    <w:bookmarkEnd w:id="44"/>
+    <w:p>
+      <w:pPr>
+        <w:numPr>
+          <w:ilvl w:val="0"/>
+          <w:numId w:val="1002"/>
+        </w:numPr>
+        <w:spacing w:line="480" w:lineRule="auto"/>
+      </w:pPr>
+      <w:r>
+        <w:t xml:space="preserve">Zhao Y, Chen H, Hu M, Xu WS, Wang D. Diffusional aging at water/oil interfaces laden with charged</w:t>
+      </w:r>
+      <w:r>
+        <w:t xml:space="preserve"> </w:t>
+      </w:r>
+      <w:r>
+        <w:t xml:space="preserve">nanoparticles studied by single-molecule tracking. Nat Commun. 2026;17:7149.</w:t>
+      </w:r>
+    </w:p>
     <w:bookmarkEnd w:id="45"/>
+    <w:bookmarkEnd w:id="46"/>
     <w:sectPr>
       <w:footerReference w:type="default" r:id="rId9"/>
       <w:lnNumType w:countBy="1" w:restart="continuous" w:distance="720"/>

</xml_diff>